<commit_message>
feat: PythonOCC 解析 STEP 文件
Co-authored-by: traeagent <traeagent@users.noreply.github.com>
</commit_message>
<xml_diff>
--- a/reports/XH-YJ38-LJ-001-A0-底盘方通A_分析报告.docx
+++ b/reports/XH-YJ38-LJ-001-A0-底盘方通A_分析报告.docx
@@ -744,7 +744,7 @@
     </w:p>
     <w:p>
       <w:r>
-        <w:t>孔总数: 8，规则孔: 6，不规则孔: 2</w:t>
+        <w:t>孔总数: 8，规则孔: 8，不规则孔: 0</w:t>
       </w:r>
     </w:p>
     <w:tbl>
@@ -755,17 +755,18 @@
         <w:tblLook w:firstColumn="1" w:firstRow="1" w:lastColumn="0" w:lastRow="0" w:noHBand="0" w:noVBand="1" w:val="04A0"/>
       </w:tblPr>
       <w:tblGrid>
-        <w:gridCol w:w="1440"/>
-        <w:gridCol w:w="1440"/>
-        <w:gridCol w:w="1440"/>
-        <w:gridCol w:w="1440"/>
-        <w:gridCol w:w="1440"/>
-        <w:gridCol w:w="1440"/>
+        <w:gridCol w:w="1234"/>
+        <w:gridCol w:w="1234"/>
+        <w:gridCol w:w="1234"/>
+        <w:gridCol w:w="1234"/>
+        <w:gridCol w:w="1234"/>
+        <w:gridCol w:w="1234"/>
+        <w:gridCol w:w="1234"/>
       </w:tblGrid>
       <w:tr>
         <w:tc>
           <w:tcPr>
-            <w:tcW w:type="dxa" w:w="1440"/>
+            <w:tcW w:type="dxa" w:w="1234"/>
           </w:tcPr>
           <w:p>
             <w:r>
@@ -775,7 +776,7 @@
         </w:tc>
         <w:tc>
           <w:tcPr>
-            <w:tcW w:type="dxa" w:w="1440"/>
+            <w:tcW w:type="dxa" w:w="1234"/>
           </w:tcPr>
           <w:p>
             <w:r>
@@ -785,7 +786,7 @@
         </w:tc>
         <w:tc>
           <w:tcPr>
-            <w:tcW w:type="dxa" w:w="1440"/>
+            <w:tcW w:type="dxa" w:w="1234"/>
           </w:tcPr>
           <w:p>
             <w:r>
@@ -795,7 +796,7 @@
         </w:tc>
         <w:tc>
           <w:tcPr>
-            <w:tcW w:type="dxa" w:w="1440"/>
+            <w:tcW w:type="dxa" w:w="1234"/>
           </w:tcPr>
           <w:p>
             <w:r>
@@ -805,21 +806,31 @@
         </w:tc>
         <w:tc>
           <w:tcPr>
-            <w:tcW w:type="dxa" w:w="1440"/>
+            <w:tcW w:type="dxa" w:w="1234"/>
           </w:tcPr>
           <w:p>
             <w:r>
-              <w:t>轴位置</w:t>
+              <w:t>槽长(mm)</w:t>
             </w:r>
           </w:p>
         </w:tc>
         <w:tc>
           <w:tcPr>
-            <w:tcW w:type="dxa" w:w="1440"/>
+            <w:tcW w:type="dxa" w:w="1234"/>
           </w:tcPr>
           <w:p>
             <w:r>
-              <w:t>轴方向</w:t>
+              <w:t>槽宽(mm)</w:t>
+            </w:r>
+          </w:p>
+        </w:tc>
+        <w:tc>
+          <w:tcPr>
+            <w:tcW w:type="dxa" w:w="1234"/>
+          </w:tcPr>
+          <w:p>
+            <w:r>
+              <w:t>轴位置/备注</w:t>
             </w:r>
           </w:p>
         </w:tc>
@@ -827,7 +838,7 @@
       <w:tr>
         <w:tc>
           <w:tcPr>
-            <w:tcW w:type="dxa" w:w="1440"/>
+            <w:tcW w:type="dxa" w:w="1234"/>
           </w:tcPr>
           <w:p>
             <w:r>
@@ -837,7 +848,7 @@
         </w:tc>
         <w:tc>
           <w:tcPr>
-            <w:tcW w:type="dxa" w:w="1440"/>
+            <w:tcW w:type="dxa" w:w="1234"/>
           </w:tcPr>
           <w:p>
             <w:r>
@@ -847,7 +858,7 @@
         </w:tc>
         <w:tc>
           <w:tcPr>
-            <w:tcW w:type="dxa" w:w="1440"/>
+            <w:tcW w:type="dxa" w:w="1234"/>
           </w:tcPr>
           <w:p>
             <w:r>
@@ -857,7 +868,7 @@
         </w:tc>
         <w:tc>
           <w:tcPr>
-            <w:tcW w:type="dxa" w:w="1440"/>
+            <w:tcW w:type="dxa" w:w="1234"/>
           </w:tcPr>
           <w:p>
             <w:r>
@@ -867,7 +878,27 @@
         </w:tc>
         <w:tc>
           <w:tcPr>
-            <w:tcW w:type="dxa" w:w="1440"/>
+            <w:tcW w:type="dxa" w:w="1234"/>
+          </w:tcPr>
+          <w:p>
+            <w:r>
+              <w:t>-</w:t>
+            </w:r>
+          </w:p>
+        </w:tc>
+        <w:tc>
+          <w:tcPr>
+            <w:tcW w:type="dxa" w:w="1234"/>
+          </w:tcPr>
+          <w:p>
+            <w:r>
+              <w:t>-</w:t>
+            </w:r>
+          </w:p>
+        </w:tc>
+        <w:tc>
+          <w:tcPr>
+            <w:tcW w:type="dxa" w:w="1234"/>
           </w:tcPr>
           <w:p>
             <w:r>
@@ -875,21 +906,11 @@
             </w:r>
           </w:p>
         </w:tc>
-        <w:tc>
-          <w:tcPr>
-            <w:tcW w:type="dxa" w:w="1440"/>
-          </w:tcPr>
-          <w:p>
-            <w:r>
-              <w:t>(0.000, 0.000, -1.000)</w:t>
-            </w:r>
-          </w:p>
-        </w:tc>
       </w:tr>
       <w:tr>
         <w:tc>
           <w:tcPr>
-            <w:tcW w:type="dxa" w:w="1440"/>
+            <w:tcW w:type="dxa" w:w="1234"/>
           </w:tcPr>
           <w:p>
             <w:r>
@@ -899,7 +920,7 @@
         </w:tc>
         <w:tc>
           <w:tcPr>
-            <w:tcW w:type="dxa" w:w="1440"/>
+            <w:tcW w:type="dxa" w:w="1234"/>
           </w:tcPr>
           <w:p>
             <w:r>
@@ -909,7 +930,7 @@
         </w:tc>
         <w:tc>
           <w:tcPr>
-            <w:tcW w:type="dxa" w:w="1440"/>
+            <w:tcW w:type="dxa" w:w="1234"/>
           </w:tcPr>
           <w:p>
             <w:r>
@@ -919,7 +940,7 @@
         </w:tc>
         <w:tc>
           <w:tcPr>
-            <w:tcW w:type="dxa" w:w="1440"/>
+            <w:tcW w:type="dxa" w:w="1234"/>
           </w:tcPr>
           <w:p>
             <w:r>
@@ -929,7 +950,27 @@
         </w:tc>
         <w:tc>
           <w:tcPr>
-            <w:tcW w:type="dxa" w:w="1440"/>
+            <w:tcW w:type="dxa" w:w="1234"/>
+          </w:tcPr>
+          <w:p>
+            <w:r>
+              <w:t>-</w:t>
+            </w:r>
+          </w:p>
+        </w:tc>
+        <w:tc>
+          <w:tcPr>
+            <w:tcW w:type="dxa" w:w="1234"/>
+          </w:tcPr>
+          <w:p>
+            <w:r>
+              <w:t>-</w:t>
+            </w:r>
+          </w:p>
+        </w:tc>
+        <w:tc>
+          <w:tcPr>
+            <w:tcW w:type="dxa" w:w="1234"/>
           </w:tcPr>
           <w:p>
             <w:r>
@@ -937,21 +978,11 @@
             </w:r>
           </w:p>
         </w:tc>
-        <w:tc>
-          <w:tcPr>
-            <w:tcW w:type="dxa" w:w="1440"/>
-          </w:tcPr>
-          <w:p>
-            <w:r>
-              <w:t>(0.000, 0.000, -1.000)</w:t>
-            </w:r>
-          </w:p>
-        </w:tc>
       </w:tr>
       <w:tr>
         <w:tc>
           <w:tcPr>
-            <w:tcW w:type="dxa" w:w="1440"/>
+            <w:tcW w:type="dxa" w:w="1234"/>
           </w:tcPr>
           <w:p>
             <w:r>
@@ -961,7 +992,7 @@
         </w:tc>
         <w:tc>
           <w:tcPr>
-            <w:tcW w:type="dxa" w:w="1440"/>
+            <w:tcW w:type="dxa" w:w="1234"/>
           </w:tcPr>
           <w:p>
             <w:r>
@@ -971,7 +1002,7 @@
         </w:tc>
         <w:tc>
           <w:tcPr>
-            <w:tcW w:type="dxa" w:w="1440"/>
+            <w:tcW w:type="dxa" w:w="1234"/>
           </w:tcPr>
           <w:p>
             <w:r>
@@ -981,7 +1012,7 @@
         </w:tc>
         <w:tc>
           <w:tcPr>
-            <w:tcW w:type="dxa" w:w="1440"/>
+            <w:tcW w:type="dxa" w:w="1234"/>
           </w:tcPr>
           <w:p>
             <w:r>
@@ -991,7 +1022,27 @@
         </w:tc>
         <w:tc>
           <w:tcPr>
-            <w:tcW w:type="dxa" w:w="1440"/>
+            <w:tcW w:type="dxa" w:w="1234"/>
+          </w:tcPr>
+          <w:p>
+            <w:r>
+              <w:t>-</w:t>
+            </w:r>
+          </w:p>
+        </w:tc>
+        <w:tc>
+          <w:tcPr>
+            <w:tcW w:type="dxa" w:w="1234"/>
+          </w:tcPr>
+          <w:p>
+            <w:r>
+              <w:t>-</w:t>
+            </w:r>
+          </w:p>
+        </w:tc>
+        <w:tc>
+          <w:tcPr>
+            <w:tcW w:type="dxa" w:w="1234"/>
           </w:tcPr>
           <w:p>
             <w:r>
@@ -999,21 +1050,11 @@
             </w:r>
           </w:p>
         </w:tc>
-        <w:tc>
-          <w:tcPr>
-            <w:tcW w:type="dxa" w:w="1440"/>
-          </w:tcPr>
-          <w:p>
-            <w:r>
-              <w:t>(0.000, 0.000, -1.000)</w:t>
-            </w:r>
-          </w:p>
-        </w:tc>
       </w:tr>
       <w:tr>
         <w:tc>
           <w:tcPr>
-            <w:tcW w:type="dxa" w:w="1440"/>
+            <w:tcW w:type="dxa" w:w="1234"/>
           </w:tcPr>
           <w:p>
             <w:r>
@@ -1023,51 +1064,61 @@
         </w:tc>
         <w:tc>
           <w:tcPr>
-            <w:tcW w:type="dxa" w:w="1440"/>
+            <w:tcW w:type="dxa" w:w="1234"/>
           </w:tcPr>
           <w:p>
             <w:r>
-              <w:t>不规则孔</w:t>
+              <w:t>规则孔（矩形/方形槽）</w:t>
             </w:r>
           </w:p>
         </w:tc>
         <w:tc>
           <w:tcPr>
-            <w:tcW w:type="dxa" w:w="1440"/>
+            <w:tcW w:type="dxa" w:w="1234"/>
           </w:tcPr>
           <w:p>
             <w:r>
-              <w:t>N/A</w:t>
+              <w:t>-</w:t>
             </w:r>
           </w:p>
         </w:tc>
         <w:tc>
           <w:tcPr>
-            <w:tcW w:type="dxa" w:w="1440"/>
+            <w:tcW w:type="dxa" w:w="1234"/>
           </w:tcPr>
           <w:p>
             <w:r>
-              <w:t>N/A</w:t>
+              <w:t>-</w:t>
             </w:r>
           </w:p>
         </w:tc>
         <w:tc>
           <w:tcPr>
-            <w:tcW w:type="dxa" w:w="1440"/>
+            <w:tcW w:type="dxa" w:w="1234"/>
           </w:tcPr>
           <w:p>
             <w:r>
-              <w:t>N/A</w:t>
+              <w:t>1101.000</w:t>
             </w:r>
           </w:p>
         </w:tc>
         <w:tc>
           <w:tcPr>
-            <w:tcW w:type="dxa" w:w="1440"/>
+            <w:tcW w:type="dxa" w:w="1234"/>
           </w:tcPr>
           <w:p>
             <w:r>
-              <w:t>N/A</w:t>
+              <w:t>38.000</w:t>
+            </w:r>
+          </w:p>
+        </w:tc>
+        <w:tc>
+          <w:tcPr>
+            <w:tcW w:type="dxa" w:w="1234"/>
+          </w:tcPr>
+          <w:p>
+            <w:r>
+              <w:t>-</w:t>
             </w:r>
           </w:p>
         </w:tc>
@@ -1075,7 +1126,7 @@
       <w:tr>
         <w:tc>
           <w:tcPr>
-            <w:tcW w:type="dxa" w:w="1440"/>
+            <w:tcW w:type="dxa" w:w="1234"/>
           </w:tcPr>
           <w:p>
             <w:r>
@@ -1085,7 +1136,7 @@
         </w:tc>
         <w:tc>
           <w:tcPr>
-            <w:tcW w:type="dxa" w:w="1440"/>
+            <w:tcW w:type="dxa" w:w="1234"/>
           </w:tcPr>
           <w:p>
             <w:r>
@@ -1095,7 +1146,7 @@
         </w:tc>
         <w:tc>
           <w:tcPr>
-            <w:tcW w:type="dxa" w:w="1440"/>
+            <w:tcW w:type="dxa" w:w="1234"/>
           </w:tcPr>
           <w:p>
             <w:r>
@@ -1105,7 +1156,7 @@
         </w:tc>
         <w:tc>
           <w:tcPr>
-            <w:tcW w:type="dxa" w:w="1440"/>
+            <w:tcW w:type="dxa" w:w="1234"/>
           </w:tcPr>
           <w:p>
             <w:r>
@@ -1115,7 +1166,27 @@
         </w:tc>
         <w:tc>
           <w:tcPr>
-            <w:tcW w:type="dxa" w:w="1440"/>
+            <w:tcW w:type="dxa" w:w="1234"/>
+          </w:tcPr>
+          <w:p>
+            <w:r>
+              <w:t>-</w:t>
+            </w:r>
+          </w:p>
+        </w:tc>
+        <w:tc>
+          <w:tcPr>
+            <w:tcW w:type="dxa" w:w="1234"/>
+          </w:tcPr>
+          <w:p>
+            <w:r>
+              <w:t>-</w:t>
+            </w:r>
+          </w:p>
+        </w:tc>
+        <w:tc>
+          <w:tcPr>
+            <w:tcW w:type="dxa" w:w="1234"/>
           </w:tcPr>
           <w:p>
             <w:r>
@@ -1123,21 +1194,11 @@
             </w:r>
           </w:p>
         </w:tc>
-        <w:tc>
-          <w:tcPr>
-            <w:tcW w:type="dxa" w:w="1440"/>
-          </w:tcPr>
-          <w:p>
-            <w:r>
-              <w:t>(0.000, 0.000, 1.000)</w:t>
-            </w:r>
-          </w:p>
-        </w:tc>
       </w:tr>
       <w:tr>
         <w:tc>
           <w:tcPr>
-            <w:tcW w:type="dxa" w:w="1440"/>
+            <w:tcW w:type="dxa" w:w="1234"/>
           </w:tcPr>
           <w:p>
             <w:r>
@@ -1147,7 +1208,7 @@
         </w:tc>
         <w:tc>
           <w:tcPr>
-            <w:tcW w:type="dxa" w:w="1440"/>
+            <w:tcW w:type="dxa" w:w="1234"/>
           </w:tcPr>
           <w:p>
             <w:r>
@@ -1157,7 +1218,7 @@
         </w:tc>
         <w:tc>
           <w:tcPr>
-            <w:tcW w:type="dxa" w:w="1440"/>
+            <w:tcW w:type="dxa" w:w="1234"/>
           </w:tcPr>
           <w:p>
             <w:r>
@@ -1167,7 +1228,7 @@
         </w:tc>
         <w:tc>
           <w:tcPr>
-            <w:tcW w:type="dxa" w:w="1440"/>
+            <w:tcW w:type="dxa" w:w="1234"/>
           </w:tcPr>
           <w:p>
             <w:r>
@@ -1177,7 +1238,27 @@
         </w:tc>
         <w:tc>
           <w:tcPr>
-            <w:tcW w:type="dxa" w:w="1440"/>
+            <w:tcW w:type="dxa" w:w="1234"/>
+          </w:tcPr>
+          <w:p>
+            <w:r>
+              <w:t>-</w:t>
+            </w:r>
+          </w:p>
+        </w:tc>
+        <w:tc>
+          <w:tcPr>
+            <w:tcW w:type="dxa" w:w="1234"/>
+          </w:tcPr>
+          <w:p>
+            <w:r>
+              <w:t>-</w:t>
+            </w:r>
+          </w:p>
+        </w:tc>
+        <w:tc>
+          <w:tcPr>
+            <w:tcW w:type="dxa" w:w="1234"/>
           </w:tcPr>
           <w:p>
             <w:r>
@@ -1185,21 +1266,11 @@
             </w:r>
           </w:p>
         </w:tc>
-        <w:tc>
-          <w:tcPr>
-            <w:tcW w:type="dxa" w:w="1440"/>
-          </w:tcPr>
-          <w:p>
-            <w:r>
-              <w:t>(0.000, 0.000, 1.000)</w:t>
-            </w:r>
-          </w:p>
-        </w:tc>
       </w:tr>
       <w:tr>
         <w:tc>
           <w:tcPr>
-            <w:tcW w:type="dxa" w:w="1440"/>
+            <w:tcW w:type="dxa" w:w="1234"/>
           </w:tcPr>
           <w:p>
             <w:r>
@@ -1209,7 +1280,7 @@
         </w:tc>
         <w:tc>
           <w:tcPr>
-            <w:tcW w:type="dxa" w:w="1440"/>
+            <w:tcW w:type="dxa" w:w="1234"/>
           </w:tcPr>
           <w:p>
             <w:r>
@@ -1219,7 +1290,7 @@
         </w:tc>
         <w:tc>
           <w:tcPr>
-            <w:tcW w:type="dxa" w:w="1440"/>
+            <w:tcW w:type="dxa" w:w="1234"/>
           </w:tcPr>
           <w:p>
             <w:r>
@@ -1229,7 +1300,7 @@
         </w:tc>
         <w:tc>
           <w:tcPr>
-            <w:tcW w:type="dxa" w:w="1440"/>
+            <w:tcW w:type="dxa" w:w="1234"/>
           </w:tcPr>
           <w:p>
             <w:r>
@@ -1239,7 +1310,27 @@
         </w:tc>
         <w:tc>
           <w:tcPr>
-            <w:tcW w:type="dxa" w:w="1440"/>
+            <w:tcW w:type="dxa" w:w="1234"/>
+          </w:tcPr>
+          <w:p>
+            <w:r>
+              <w:t>-</w:t>
+            </w:r>
+          </w:p>
+        </w:tc>
+        <w:tc>
+          <w:tcPr>
+            <w:tcW w:type="dxa" w:w="1234"/>
+          </w:tcPr>
+          <w:p>
+            <w:r>
+              <w:t>-</w:t>
+            </w:r>
+          </w:p>
+        </w:tc>
+        <w:tc>
+          <w:tcPr>
+            <w:tcW w:type="dxa" w:w="1234"/>
           </w:tcPr>
           <w:p>
             <w:r>
@@ -1247,21 +1338,11 @@
             </w:r>
           </w:p>
         </w:tc>
-        <w:tc>
-          <w:tcPr>
-            <w:tcW w:type="dxa" w:w="1440"/>
-          </w:tcPr>
-          <w:p>
-            <w:r>
-              <w:t>(0.000, 0.000, 1.000)</w:t>
-            </w:r>
-          </w:p>
-        </w:tc>
       </w:tr>
       <w:tr>
         <w:tc>
           <w:tcPr>
-            <w:tcW w:type="dxa" w:w="1440"/>
+            <w:tcW w:type="dxa" w:w="1234"/>
           </w:tcPr>
           <w:p>
             <w:r>
@@ -1271,51 +1352,61 @@
         </w:tc>
         <w:tc>
           <w:tcPr>
-            <w:tcW w:type="dxa" w:w="1440"/>
+            <w:tcW w:type="dxa" w:w="1234"/>
           </w:tcPr>
           <w:p>
             <w:r>
-              <w:t>不规则孔</w:t>
+              <w:t>规则孔（矩形/方形槽）</w:t>
             </w:r>
           </w:p>
         </w:tc>
         <w:tc>
           <w:tcPr>
-            <w:tcW w:type="dxa" w:w="1440"/>
+            <w:tcW w:type="dxa" w:w="1234"/>
           </w:tcPr>
           <w:p>
             <w:r>
-              <w:t>N/A</w:t>
+              <w:t>-</w:t>
             </w:r>
           </w:p>
         </w:tc>
         <w:tc>
           <w:tcPr>
-            <w:tcW w:type="dxa" w:w="1440"/>
+            <w:tcW w:type="dxa" w:w="1234"/>
           </w:tcPr>
           <w:p>
             <w:r>
-              <w:t>N/A</w:t>
+              <w:t>-</w:t>
             </w:r>
           </w:p>
         </w:tc>
         <w:tc>
           <w:tcPr>
-            <w:tcW w:type="dxa" w:w="1440"/>
+            <w:tcW w:type="dxa" w:w="1234"/>
           </w:tcPr>
           <w:p>
             <w:r>
-              <w:t>N/A</w:t>
+              <w:t>1101.000</w:t>
             </w:r>
           </w:p>
         </w:tc>
         <w:tc>
           <w:tcPr>
-            <w:tcW w:type="dxa" w:w="1440"/>
+            <w:tcW w:type="dxa" w:w="1234"/>
           </w:tcPr>
           <w:p>
             <w:r>
-              <w:t>N/A</w:t>
+              <w:t>38.000</w:t>
+            </w:r>
+          </w:p>
+        </w:tc>
+        <w:tc>
+          <w:tcPr>
+            <w:tcW w:type="dxa" w:w="1234"/>
+          </w:tcPr>
+          <w:p>
+            <w:r>
+              <w:t>-</w:t>
             </w:r>
           </w:p>
         </w:tc>

</xml_diff>